<commit_message>
Record counsel sign-off on footer in plans
Co-Authored-By: Claude Opus 5.5 <noreply@anthropic.com>
Claude-Session: https://claude.ai/code/session_01VLMDQvyzXwonaRACCHVmjk
</commit_message>
<xml_diff>
--- a/auracurate/docs/Aurora_푸터_법적고지_기획서.docx
+++ b/auracurate/docs/Aurora_푸터_법적고지_기획서.docx
@@ -509,7 +509,7 @@
                 <w:sz w:val="18"/>
                 <w:szCs w:val="18"/>
               </w:rPr>
-              <w:t xml:space="preserve">중요</w:t>
+              <w:t xml:space="preserve">법무</w:t>
             </w:r>
           </w:p>
         </w:tc>
@@ -539,7 +539,7 @@
                 <w:sz w:val="18"/>
                 <w:szCs w:val="18"/>
               </w:rPr>
-              <w:t xml:space="preserve">이 문서는 법률 자문이 아닙니다. 공개 전 미국 변호사 검토가 필요합니다.</w:t>
+              <w:t xml:space="preserve">푸터: 변호사 확인 완료, 진행 승인 (2026-10-04, 대표 전달). 정책 본문: 게시 전 확인 권장</w:t>
             </w:r>
           </w:p>
         </w:tc>

</xml_diff>